<commit_message>
Record final reckoning prompts in prompt log and prompt documentation
- Append the 'exec hulingpaksa.md' entry to PROMPT_LOG.md documenting the design polish and production release work.

- Append the header-brand-rename entry covering the eajen.free.nf title change and InfinityFree cleanup.

- Regenerate AI_PROMPT_DOCUMENTATION.docx with the same two new entries so both prompt logs stay in sync.
</commit_message>
<xml_diff>
--- a/AI_PROMPT_DOCUMENTATION.docx
+++ b/AI_PROMPT_DOCUMENTATION.docx
@@ -1,5 +1,70 @@
 
-<file path=word/document.xml><?xml version="1.0" encoding="utf-8"?>
+<file path=customXml\item1.xml><?xml version="1.0" encoding="utf-8"?>
+<b:Sources xmlns:b="http://schemas.openxmlformats.org/officeDocument/2006/bibliography" xmlns="http://schemas.openxmlformats.org/officeDocument/2006/bibliography" SelectedStyle="/APA.XSL" StyleName="APA"/>
+</file>
+
+<file path=customXml\itemProps1.xml><?xml version="1.0" encoding="utf-8"?>
+<ds:datastoreItem xmlns:ds="http://schemas.openxmlformats.org/officeDocument/2006/customXml" ds:itemID="{EF278816-EC6F-A645-907D-7F25AECB1D4A}">
+  <ds:schemaRefs>
+    <ds:schemaRef ds:uri="http://schemas.openxmlformats.org/officeDocument/2006/bibliography"/>
+  </ds:schemaRefs>
+</ds:datastoreItem>
+</file>
+
+<file path=docProps\app.xml><?xml version="1.0" encoding="utf-8"?>
+<Properties xmlns="http://schemas.openxmlformats.org/officeDocument/2006/extended-properties" xmlns:vt="http://schemas.openxmlformats.org/officeDocument/2006/docPropsVTypes">
+  <Template>Normal.dotm</Template>
+  <TotalTime>0</TotalTime>
+  <Pages>1</Pages>
+  <Words>0</Words>
+  <Characters>0</Characters>
+  <Application>Microsoft Macintosh Word</Application>
+  <DocSecurity>0</DocSecurity>
+  <Lines>0</Lines>
+  <Paragraphs>0</Paragraphs>
+  <ScaleCrop>false</ScaleCrop>
+  <HeadingPairs>
+    <vt:vector size="2" baseType="variant">
+      <vt:variant>
+        <vt:lpstr>Title</vt:lpstr>
+      </vt:variant>
+      <vt:variant>
+        <vt:i4>1</vt:i4>
+      </vt:variant>
+    </vt:vector>
+  </HeadingPairs>
+  <TitlesOfParts>
+    <vt:vector size="1" baseType="lpstr">
+      <vt:lpstr/>
+    </vt:vector>
+  </TitlesOfParts>
+  <Manager/>
+  <Company/>
+  <LinksUpToDate>false</LinksUpToDate>
+  <CharactersWithSpaces>0</CharactersWithSpaces>
+  <SharedDoc>false</SharedDoc>
+  <HyperlinkBase/>
+  <HyperlinksChanged>false</HyperlinksChanged>
+  <AppVersion>14.0000</AppVersion>
+</Properties>
+</file>
+
+<file path=docProps\core.xml><?xml version="1.0" encoding="utf-8"?>
+<cp:coreProperties xmlns:cp="http://schemas.openxmlformats.org/package/2006/metadata/core-properties" xmlns:dc="http://purl.org/dc/elements/1.1/" xmlns:dcterms="http://purl.org/dc/terms/" xmlns:dcmitype="http://purl.org/dc/dcmitype/" xmlns:xsi="http://www.w3.org/2001/XMLSchema-instance">
+  <dc:title/>
+  <dc:subject/>
+  <dc:creator>python-docx</dc:creator>
+  <cp:keywords/>
+  <dc:description>generated by python-docx</dc:description>
+  <cp:lastModifiedBy/>
+  <cp:revision>1</cp:revision>
+  <dcterms:created xsi:type="dcterms:W3CDTF">2013-12-23T23:15:00Z</dcterms:created>
+  <dcterms:modified xsi:type="dcterms:W3CDTF">2013-12-23T23:15:00Z</dcterms:modified>
+  <cp:category/>
+</cp:coreProperties>
+</file>
+
+<file path=word\document.xml><?xml version="1.0" encoding="utf-8"?>
 <w:document xmlns:wpc="http://schemas.microsoft.com/office/word/2010/wordprocessingCanvas" xmlns:mo="http://schemas.microsoft.com/office/mac/office/2008/main" xmlns:mc="http://schemas.openxmlformats.org/markup-compatibility/2006" xmlns:mv="urn:schemas-microsoft-com:mac:vml" xmlns:o="urn:schemas-microsoft-com:office:office" xmlns:r="http://schemas.openxmlformats.org/officeDocument/2006/relationships" xmlns:m="http://schemas.openxmlformats.org/officeDocument/2006/math" xmlns:v="urn:schemas-microsoft-com:vml" xmlns:wp14="http://schemas.microsoft.com/office/word/2010/wordprocessingDrawing" xmlns:wp="http://schemas.openxmlformats.org/drawingml/2006/wordprocessingDrawing" xmlns:w10="urn:schemas-microsoft-com:office:word" xmlns:w="http://schemas.openxmlformats.org/wordprocessingml/2006/main" xmlns:w14="http://schemas.microsoft.com/office/word/2010/wordml" xmlns:wpg="http://schemas.microsoft.com/office/word/2010/wordprocessingGroup" xmlns:wpi="http://schemas.microsoft.com/office/word/2010/wordprocessingInk" xmlns:wne="http://schemas.microsoft.com/office/word/2006/wordml" xmlns:wps="http://schemas.microsoft.com/office/word/2010/wordprocessingShape" mc:Ignorable="w14 wp14">
   <w:body>
     <w:p>
@@ -282,6 +347,80 @@
         <w:t>Big Pickle renamed PROMPT_LOG.docx to AI_PROMPT_DOCUMENTATION.docx, generated a separate COMMIT_HISTORY.docx listing the latest git commits, and updated both prompt logs (PROMPT_LOG.md and the renamed AI_PROMPT_DOCUMENTATION.docx) with this entry before pushing the changes.</w:t>
       </w:r>
     </w:p>
+    <w:p>
+      <w:pPr>
+        <w:pStyle w:val="Heading1"/>
+      </w:pPr>
+      <w:r>
+        <w:t>The Final Reckoning — Design Polish and Production Release</w:t>
+      </w:r>
+    </w:p>
+    <w:p>
+      <w:pPr>
+        <w:pStyle w:val="ListBullet"/>
+      </w:pPr>
+      <w:r>
+        <w:t>Prompt used:</w:t>
+      </w:r>
+    </w:p>
+    <w:p>
+      <w:r>
+        <w:rPr>
+          <w:i/>
+        </w:rPr>
+        <w:t>"exec hulingpaksa.md, update both promptdocu and promptlog"</w:t>
+      </w:r>
+    </w:p>
+    <w:p>
+      <w:pPr>
+        <w:pStyle w:val="ListBullet"/>
+      </w:pPr>
+      <w:r>
+        <w:t>Result/Output:</w:t>
+      </w:r>
+    </w:p>
+    <w:p>
+      <w:r>
+        <w:t>Big Pickle followed the hulingpaksa.md (final reckoning) process. It installed the motion.dev 'motion' package, rewrote resources/js/app.js to drive scroll-reveal entrance animations (respecting prefers-reduced-motion), and added data-reveal / data-reveal-item attributes across the hero, education, experience, skills, projects, and connect sections, plus a gradient text treatment on the hero name. It thoroughly checked the app (HTTP 200, clean Vite production build) and pushed a comprehensive commit. At the ask-to-proceed checkpoint it asked how to continue.</w:t>
+      </w:r>
+    </w:p>
+    <w:p>
+      <w:pPr>
+        <w:pStyle w:val="Heading1"/>
+      </w:pPr>
+      <w:r>
+        <w:t>Renaming the Header Brand Title</w:t>
+      </w:r>
+    </w:p>
+    <w:p>
+      <w:pPr>
+        <w:pStyle w:val="ListBullet"/>
+      </w:pPr>
+      <w:r>
+        <w:t>Prompt used:</w:t>
+      </w:r>
+    </w:p>
+    <w:p>
+      <w:r>
+        <w:rPr>
+          <w:i/>
+        </w:rPr>
+        <w:t>(Answer to Big Pickle's ask-to-proceed question) "update header tile 'EB' with 'eajen.free.nf' before full finalization."</w:t>
+      </w:r>
+    </w:p>
+    <w:p>
+      <w:pPr>
+        <w:pStyle w:val="ListBullet"/>
+      </w:pPr>
+      <w:r>
+        <w:t>Result/Output:</w:t>
+      </w:r>
+    </w:p>
+    <w:p>
+      <w:r>
+        <w:t>Big Pickle changed the navigation header brand from "EB" to "eajen.free.nf", rebuilt the assets (clean production build), and committed the change. Continuing the finalization, it committed the InfinityFree production release files (htdocs.htaccess and .env.infinityfree), documented the deployment in README.md, then updated both prompt logs (PROMPT_LOG.md and AI_PROMPT_DOCUMENTATION.docx) before the final push.</w:t>
+      </w:r>
+    </w:p>
     <w:sectPr>
       <w:pgSz w:w="12240" w:h="15840"/>
       <w:pgMar w:top="1440" w:right="1800" w:bottom="1440" w:left="1800" w:header="720" w:footer="720" w:gutter="0"/>
@@ -292,7 +431,70 @@
 </w:document>
 </file>
 
-<file path=word/numbering.xml><?xml version="1.0" encoding="utf-8"?>
+<file path=word\fontTable.xml><?xml version="1.0" encoding="utf-8"?>
+<w:fonts xmlns:mc="http://schemas.openxmlformats.org/markup-compatibility/2006" xmlns:r="http://schemas.openxmlformats.org/officeDocument/2006/relationships" xmlns:w="http://schemas.openxmlformats.org/wordprocessingml/2006/main" xmlns:w14="http://schemas.microsoft.com/office/word/2010/wordml" mc:Ignorable="w14">
+  <w:font w:name="Symbol">
+    <w:panose1 w:val="00000000000000000000"/>
+    <w:charset w:val="02"/>
+    <w:family w:val="auto"/>
+    <w:pitch w:val="variable"/>
+    <w:sig w:usb0="00000000" w:usb1="10000000" w:usb2="00000000" w:usb3="00000000" w:csb0="80000000" w:csb1="00000000"/>
+  </w:font>
+  <w:font w:name="Times New Roman">
+    <w:panose1 w:val="02020603050405020304"/>
+    <w:charset w:val="00"/>
+    <w:family w:val="auto"/>
+    <w:pitch w:val="variable"/>
+    <w:sig w:usb0="E0002AFF" w:usb1="C0007841" w:usb2="00000009" w:usb3="00000000" w:csb0="000001FF" w:csb1="00000000"/>
+  </w:font>
+  <w:font w:name="Cambria">
+    <w:panose1 w:val="02040503050406030204"/>
+    <w:charset w:val="00"/>
+    <w:family w:val="auto"/>
+    <w:pitch w:val="variable"/>
+    <w:sig w:usb0="E00002FF" w:usb1="400004FF" w:usb2="00000000" w:usb3="00000000" w:csb0="0000019F" w:csb1="00000000"/>
+  </w:font>
+  <w:font w:name="ＭＳ 明朝">
+    <w:panose1 w:val="00000000000000000000"/>
+    <w:charset w:val="80"/>
+    <w:family w:val="roman"/>
+    <w:notTrueType/>
+    <w:pitch w:val="fixed"/>
+    <w:sig w:usb0="00000001" w:usb1="08070000" w:usb2="00000010" w:usb3="00000000" w:csb0="00020000" w:csb1="00000000"/>
+  </w:font>
+  <w:font w:name="Calibri">
+    <w:panose1 w:val="020F0502020204030204"/>
+    <w:charset w:val="00"/>
+    <w:family w:val="auto"/>
+    <w:pitch w:val="variable"/>
+    <w:sig w:usb0="E10002FF" w:usb1="4000ACFF" w:usb2="00000009" w:usb3="00000000" w:csb0="0000019F" w:csb1="00000000"/>
+  </w:font>
+  <w:font w:name="ＭＳ ゴシック">
+    <w:panose1 w:val="00000000000000000000"/>
+    <w:charset w:val="80"/>
+    <w:family w:val="modern"/>
+    <w:notTrueType/>
+    <w:pitch w:val="fixed"/>
+    <w:sig w:usb0="00000001" w:usb1="08070000" w:usb2="00000010" w:usb3="00000000" w:csb0="00020000" w:csb1="00000000"/>
+  </w:font>
+  <w:font w:name="Courier">
+    <w:panose1 w:val="02000500000000000000"/>
+    <w:charset w:val="00"/>
+    <w:family w:val="auto"/>
+    <w:pitch w:val="variable"/>
+    <w:sig w:usb0="00000003" w:usb1="00000000" w:usb2="00000000" w:usb3="00000000" w:csb0="00000001" w:csb1="00000000"/>
+  </w:font>
+  <w:font w:name="Arial">
+    <w:panose1 w:val="020B0604020202020204"/>
+    <w:charset w:val="00"/>
+    <w:family w:val="auto"/>
+    <w:pitch w:val="variable"/>
+    <w:sig w:usb0="E0002AFF" w:usb1="C0007843" w:usb2="00000009" w:usb3="00000000" w:csb0="000001FF" w:csb1="00000000"/>
+  </w:font>
+</w:fonts>
+</file>
+
+<file path=word\numbering.xml><?xml version="1.0" encoding="utf-8"?>
 <w:numbering xmlns:wpc="http://schemas.microsoft.com/office/word/2010/wordprocessingCanvas" xmlns:mo="http://schemas.microsoft.com/office/mac/office/2008/main" xmlns:mc="http://schemas.openxmlformats.org/markup-compatibility/2006" xmlns:mv="urn:schemas-microsoft-com:mac:vml" xmlns:o="urn:schemas-microsoft-com:office:office" xmlns:r="http://schemas.openxmlformats.org/officeDocument/2006/relationships" xmlns:m="http://schemas.openxmlformats.org/officeDocument/2006/math" xmlns:v="urn:schemas-microsoft-com:vml" xmlns:wp14="http://schemas.microsoft.com/office/word/2010/wordprocessingDrawing" xmlns:wp="http://schemas.openxmlformats.org/drawingml/2006/wordprocessingDrawing" xmlns:w10="urn:schemas-microsoft-com:office:word" xmlns:w="http://schemas.openxmlformats.org/wordprocessingml/2006/main" xmlns:w14="http://schemas.microsoft.com/office/word/2010/wordml" xmlns:wpg="http://schemas.microsoft.com/office/word/2010/wordprocessingGroup" xmlns:wpi="http://schemas.microsoft.com/office/word/2010/wordprocessingInk" xmlns:wne="http://schemas.microsoft.com/office/word/2006/wordml" xmlns:wps="http://schemas.microsoft.com/office/word/2010/wordprocessingShape" mc:Ignorable="w14 wp14">
   <w:abstractNum w:abstractNumId="0">
     <w:nsid w:val="FFFFFF7C"/>
@@ -495,7 +697,62 @@
 </w:numbering>
 </file>
 
-<file path=word/styles.xml><?xml version="1.0" encoding="utf-8"?>
+<file path=word\settings.xml><?xml version="1.0" encoding="utf-8"?>
+<w:settings xmlns:mc="http://schemas.openxmlformats.org/markup-compatibility/2006" xmlns:o="urn:schemas-microsoft-com:office:office" xmlns:r="http://schemas.openxmlformats.org/officeDocument/2006/relationships" xmlns:m="http://schemas.openxmlformats.org/officeDocument/2006/math" xmlns:v="urn:schemas-microsoft-com:vml" xmlns:w10="urn:schemas-microsoft-com:office:word" xmlns:w="http://schemas.openxmlformats.org/wordprocessingml/2006/main" xmlns:w14="http://schemas.microsoft.com/office/word/2010/wordml" xmlns:sl="http://schemas.openxmlformats.org/schemaLibrary/2006/main" mc:Ignorable="w14">
+  <w:zoom w:val="bestFit"/>
+  <w:proofState w:spelling="clean" w:grammar="clean"/>
+  <w:defaultTabStop w:val="720"/>
+  <w:characterSpacingControl w:val="doNotCompress"/>
+  <w:savePreviewPicture/>
+  <w:compat>
+    <w:useFELayout/>
+    <w:compatSetting w:name="compatibilityMode" w:uri="http://schemas.microsoft.com/office/word" w:val="14"/>
+    <w:compatSetting w:name="overrideTableStyleFontSizeAndJustification" w:uri="http://schemas.microsoft.com/office/word" w:val="1"/>
+    <w:compatSetting w:name="enableOpenTypeFeatures" w:uri="http://schemas.microsoft.com/office/word" w:val="1"/>
+    <w:compatSetting w:name="doNotFlipMirrorIndents" w:uri="http://schemas.microsoft.com/office/word" w:val="1"/>
+  </w:compat>
+  <w:rsids>
+    <w:rsidRoot w:val="00B47730"/>
+    <w:rsid w:val="00034616"/>
+    <w:rsid w:val="0006063C"/>
+    <w:rsid w:val="0015074B"/>
+    <w:rsid w:val="0029639D"/>
+    <w:rsid w:val="00326F90"/>
+    <w:rsid w:val="00AA1D8D"/>
+    <w:rsid w:val="00B47730"/>
+    <w:rsid w:val="00CB0664"/>
+    <w:rsid w:val="00FC693F"/>
+  </w:rsids>
+  <m:mathPr>
+    <m:mathFont m:val="Cambria Math"/>
+    <m:brkBin m:val="before"/>
+    <m:brkBinSub m:val="--"/>
+    <m:smallFrac m:val="0"/>
+    <m:dispDef/>
+    <m:lMargin m:val="0"/>
+    <m:rMargin m:val="0"/>
+    <m:defJc m:val="centerGroup"/>
+    <m:wrapIndent m:val="1440"/>
+    <m:intLim m:val="subSup"/>
+    <m:naryLim m:val="undOvr"/>
+  </m:mathPr>
+  <w:themeFontLang w:val="en-US" w:eastAsia="ja-JP"/>
+  <w:clrSchemeMapping w:bg1="light1" w:t1="dark1" w:bg2="light2" w:t2="dark2" w:accent1="accent1" w:accent2="accent2" w:accent3="accent3" w:accent4="accent4" w:accent5="accent5" w:accent6="accent6" w:hyperlink="hyperlink" w:followedHyperlink="followedHyperlink"/>
+  <w:doNotAutoCompressPictures/>
+  <w:shapeDefaults>
+    <o:shapedefaults v:ext="edit" spidmax="1027"/>
+    <o:shapelayout v:ext="edit">
+      <o:idmap v:ext="edit" data="1"/>
+    </o:shapelayout>
+  </w:shapeDefaults>
+  <w:decimalSymbol w:val="."/>
+  <w:listSeparator w:val=","/>
+  <w14:docId w14:val="24062061"/>
+  <w14:defaultImageDpi w14:val="300"/>
+</w:settings>
+</file>
+
+<file path=word\styles.xml><?xml version="1.0" encoding="utf-8"?>
 <w:styles xmlns:mc="http://schemas.openxmlformats.org/markup-compatibility/2006" xmlns:r="http://schemas.openxmlformats.org/officeDocument/2006/relationships" xmlns:w="http://schemas.openxmlformats.org/wordprocessingml/2006/main" xmlns:w14="http://schemas.microsoft.com/office/word/2010/wordml" mc:Ignorable="w14">
   <w:docDefaults>
     <w:rPrDefault>
@@ -12341,7 +12598,7 @@
 </w:styles>
 </file>
 
-<file path=word/stylesWithEffects.xml><?xml version="1.0" encoding="utf-8"?>
+<file path=word\stylesWithEffects.xml><?xml version="1.0" encoding="utf-8"?>
 <w:styles xmlns:wpc="http://schemas.microsoft.com/office/word/2010/wordprocessingCanvas" xmlns:mo="http://schemas.microsoft.com/office/mac/office/2008/main" xmlns:mc="http://schemas.openxmlformats.org/markup-compatibility/2006" xmlns:mv="urn:schemas-microsoft-com:mac:vml" xmlns:o="urn:schemas-microsoft-com:office:office" xmlns:r="http://schemas.openxmlformats.org/officeDocument/2006/relationships" xmlns:m="http://schemas.openxmlformats.org/officeDocument/2006/math" xmlns:v="urn:schemas-microsoft-com:vml" xmlns:wp14="http://schemas.microsoft.com/office/word/2010/wordprocessingDrawing" xmlns:wp="http://schemas.openxmlformats.org/drawingml/2006/wordprocessingDrawing" xmlns:w10="urn:schemas-microsoft-com:office:word" xmlns:w="http://schemas.openxmlformats.org/wordprocessingml/2006/main" xmlns:w14="http://schemas.microsoft.com/office/word/2010/wordml" xmlns:wpg="http://schemas.microsoft.com/office/word/2010/wordprocessingGroup" xmlns:wpi="http://schemas.microsoft.com/office/word/2010/wordprocessingInk" xmlns:wne="http://schemas.microsoft.com/office/word/2006/wordml" xmlns:wps="http://schemas.microsoft.com/office/word/2010/wordprocessingShape" mc:Ignorable="w14 wp14">
   <w:docDefaults>
     <w:rPrDefault>
@@ -24143,7 +24400,7 @@
 </w:styles>
 </file>
 
-<file path=word/theme/theme1.xml><?xml version="1.0" encoding="utf-8"?>
+<file path=word\theme\theme1.xml><?xml version="1.0" encoding="utf-8"?>
 <a:theme xmlns:a="http://schemas.openxmlformats.org/drawingml/2006/main" name="Office Theme">
   <a:themeElements>
     <a:clrScheme name="Office">
@@ -24463,14 +24720,9 @@
 </a:theme>
 </file>
 
-<file path=customXml/item1.xml><?xml version="1.0" encoding="utf-8"?>
-<b:Sources xmlns:b="http://schemas.openxmlformats.org/officeDocument/2006/bibliography" xmlns="http://schemas.openxmlformats.org/officeDocument/2006/bibliography" SelectedStyle="/APA.XSL" StyleName="APA"/>
-</file>
-
-<file path=customXml/itemProps1.xml><?xml version="1.0" encoding="utf-8"?>
-<ds:datastoreItem xmlns:ds="http://schemas.openxmlformats.org/officeDocument/2006/customXml" ds:itemID="{EF278816-EC6F-A645-907D-7F25AECB1D4A}">
-  <ds:schemaRefs>
-    <ds:schemaRef ds:uri="http://schemas.openxmlformats.org/officeDocument/2006/bibliography"/>
-  </ds:schemaRefs>
-</ds:datastoreItem>
+<file path=word\webSettings.xml><?xml version="1.0" encoding="utf-8"?>
+<w:webSettings xmlns:mc="http://schemas.openxmlformats.org/markup-compatibility/2006" xmlns:r="http://schemas.openxmlformats.org/officeDocument/2006/relationships" xmlns:w="http://schemas.openxmlformats.org/wordprocessingml/2006/main" xmlns:w14="http://schemas.microsoft.com/office/word/2010/wordml" mc:Ignorable="w14">
+  <w:allowPNG/>
+  <w:doNotSaveAsSingleFile/>
+</w:webSettings>
 </file>
</xml_diff>

<commit_message>
Apply patchup.md Awwwards design polish: OLED glass UI, double-bezel cards, motion spring reveals, Three.js particle background, plus final docs and prompt logs
</commit_message>
<xml_diff>
--- a/AI_PROMPT_DOCUMENTATION.docx
+++ b/AI_PROMPT_DOCUMENTATION.docx
@@ -1,424 +1,701 @@
 
-<file path=customXml\item1.xml><?xml version="1.0" encoding="utf-8"?>
-<b:Sources xmlns:b="http://schemas.openxmlformats.org/officeDocument/2006/bibliography" xmlns="http://schemas.openxmlformats.org/officeDocument/2006/bibliography" SelectedStyle="/APA.XSL" StyleName="APA"/>
-</file>
-
-<file path=customXml\itemProps1.xml><?xml version="1.0" encoding="utf-8"?>
-<ds:datastoreItem xmlns:ds="http://schemas.openxmlformats.org/officeDocument/2006/customXml" ds:itemID="{EF278816-EC6F-A645-907D-7F25AECB1D4A}">
-  <ds:schemaRefs>
-    <ds:schemaRef ds:uri="http://schemas.openxmlformats.org/officeDocument/2006/bibliography"/>
-  </ds:schemaRefs>
-</ds:datastoreItem>
-</file>
-
-<file path=docProps\app.xml><?xml version="1.0" encoding="utf-8"?>
-<Properties xmlns="http://schemas.openxmlformats.org/officeDocument/2006/extended-properties" xmlns:vt="http://schemas.openxmlformats.org/officeDocument/2006/docPropsVTypes">
-  <Template>Normal.dotm</Template>
-  <TotalTime>0</TotalTime>
-  <Pages>1</Pages>
-  <Words>0</Words>
-  <Characters>0</Characters>
-  <Application>Microsoft Macintosh Word</Application>
-  <DocSecurity>0</DocSecurity>
-  <Lines>0</Lines>
-  <Paragraphs>0</Paragraphs>
-  <ScaleCrop>false</ScaleCrop>
-  <HeadingPairs>
-    <vt:vector size="2" baseType="variant">
-      <vt:variant>
-        <vt:lpstr>Title</vt:lpstr>
-      </vt:variant>
-      <vt:variant>
-        <vt:i4>1</vt:i4>
-      </vt:variant>
-    </vt:vector>
-  </HeadingPairs>
-  <TitlesOfParts>
-    <vt:vector size="1" baseType="lpstr">
-      <vt:lpstr/>
-    </vt:vector>
-  </TitlesOfParts>
-  <Manager/>
-  <Company/>
-  <LinksUpToDate>false</LinksUpToDate>
-  <CharactersWithSpaces>0</CharactersWithSpaces>
-  <SharedDoc>false</SharedDoc>
-  <HyperlinkBase/>
-  <HyperlinksChanged>false</HyperlinksChanged>
-  <AppVersion>14.0000</AppVersion>
-</Properties>
-</file>
-
-<file path=docProps\core.xml><?xml version="1.0" encoding="utf-8"?>
-<cp:coreProperties xmlns:cp="http://schemas.openxmlformats.org/package/2006/metadata/core-properties" xmlns:dc="http://purl.org/dc/elements/1.1/" xmlns:dcterms="http://purl.org/dc/terms/" xmlns:dcmitype="http://purl.org/dc/dcmitype/" xmlns:xsi="http://www.w3.org/2001/XMLSchema-instance">
-  <dc:title/>
-  <dc:subject/>
-  <dc:creator>python-docx</dc:creator>
-  <cp:keywords/>
-  <dc:description>generated by python-docx</dc:description>
-  <cp:lastModifiedBy/>
-  <cp:revision>1</cp:revision>
-  <dcterms:created xsi:type="dcterms:W3CDTF">2013-12-23T23:15:00Z</dcterms:created>
-  <dcterms:modified xsi:type="dcterms:W3CDTF">2013-12-23T23:15:00Z</dcterms:modified>
-  <cp:category/>
-</cp:coreProperties>
-</file>
-
-<file path=word\document.xml><?xml version="1.0" encoding="utf-8"?>
+<file path=word/document.xml><?xml version="1.0" encoding="utf-8"?>
 <w:document xmlns:wpc="http://schemas.microsoft.com/office/word/2010/wordprocessingCanvas" xmlns:mo="http://schemas.microsoft.com/office/mac/office/2008/main" xmlns:mc="http://schemas.openxmlformats.org/markup-compatibility/2006" xmlns:mv="urn:schemas-microsoft-com:mac:vml" xmlns:o="urn:schemas-microsoft-com:office:office" xmlns:r="http://schemas.openxmlformats.org/officeDocument/2006/relationships" xmlns:m="http://schemas.openxmlformats.org/officeDocument/2006/math" xmlns:v="urn:schemas-microsoft-com:vml" xmlns:wp14="http://schemas.microsoft.com/office/word/2010/wordprocessingDrawing" xmlns:wp="http://schemas.openxmlformats.org/drawingml/2006/wordprocessingDrawing" xmlns:w10="urn:schemas-microsoft-com:office:word" xmlns:w="http://schemas.openxmlformats.org/wordprocessingml/2006/main" xmlns:w14="http://schemas.microsoft.com/office/word/2010/wordml" xmlns:wpg="http://schemas.microsoft.com/office/word/2010/wordprocessingGroup" xmlns:wpi="http://schemas.microsoft.com/office/word/2010/wordprocessingInk" xmlns:wne="http://schemas.microsoft.com/office/word/2006/wordml" xmlns:wps="http://schemas.microsoft.com/office/word/2010/wordprocessingShape" mc:Ignorable="w14 wp14">
   <w:body>
     <w:p>
       <w:pPr>
-        <w:pStyle w:val="Title"/>
+        <w:spacing w:after="120"/>
       </w:pPr>
       <w:r>
+        <w:rPr>
+          <w:b/>
+          <w:sz w:val="36"/>
+        </w:rPr>
         <w:t>PROMPT LOG</w:t>
       </w:r>
     </w:p>
     <w:p>
       <w:pPr>
-        <w:jc w:val="center"/>
+        <w:spacing w:after="120"/>
       </w:pPr>
       <w:r>
+        <w:rPr>
+          <w:b/>
+          <w:sz w:val="26"/>
+        </w:rPr>
         <w:t>Portfolio Project - Big Pickle Agent Report</w:t>
       </w:r>
     </w:p>
     <w:p>
+      <w:pPr>
+        <w:spacing w:after="120"/>
+      </w:pPr>
       <w:r>
+        <w:rPr>
+          <w:b w:val="0"/>
+          <w:sz w:val="22"/>
+        </w:rPr>
         <w:t>This document records all prompts the user actually entered during the development of the portfolio project, in the order they were used, start to finish, together with the report of the agent (Big Pickle).</w:t>
       </w:r>
     </w:p>
     <w:p>
       <w:pPr>
-        <w:pStyle w:val="Heading1"/>
+        <w:spacing w:after="200"/>
       </w:pPr>
       <w:r>
+        <w:rPr>
+          <w:b/>
+          <w:sz w:val="28"/>
+        </w:rPr>
         <w:t>Starting the Project</w:t>
       </w:r>
     </w:p>
     <w:p>
       <w:pPr>
-        <w:pStyle w:val="ListBullet"/>
+        <w:spacing w:after="40"/>
       </w:pPr>
       <w:r>
+        <w:rPr>
+          <w:b/>
+          <w:sz w:val="22"/>
+        </w:rPr>
         <w:t>Prompt used:</w:t>
       </w:r>
     </w:p>
     <w:p>
+      <w:pPr>
+        <w:spacing w:after="120"/>
+      </w:pPr>
       <w:r>
         <w:rPr>
-          <w:i/>
+          <w:b w:val="0"/>
+          <w:sz w:val="22"/>
         </w:rPr>
-        <w:t>"implement greatplan.md"</w:t>
+        <w:t>implement greatplan.md</w:t>
       </w:r>
     </w:p>
     <w:p>
       <w:pPr>
-        <w:pStyle w:val="ListBullet"/>
+        <w:spacing w:after="40"/>
       </w:pPr>
       <w:r>
+        <w:rPr>
+          <w:b/>
+          <w:sz w:val="22"/>
+        </w:rPr>
         <w:t>Result/Output:</w:t>
       </w:r>
     </w:p>
     <w:p>
+      <w:pPr>
+        <w:spacing w:after="120"/>
+      </w:pPr>
       <w:r>
+        <w:rPr>
+          <w:b w:val="0"/>
+          <w:sz w:val="22"/>
+        </w:rPr>
         <w:t>Big Pickle read greatplan.md to understand the requirements and resume.md as the source data. It scaffolded a Laravel v13 project, installed Tailwind CSS via Vite, built a dark-mode portfolio with Basic Information, Educational Background, Projects, and GitHub Repository Links sections, created README.md and PROMPT_LOG.md, tested the app (HTTP 200, no build errors), and committed everything to a standalone git repository.</w:t>
       </w:r>
     </w:p>
     <w:p>
       <w:pPr>
-        <w:pStyle w:val="Heading1"/>
+        <w:spacing w:after="200"/>
       </w:pPr>
       <w:r>
+        <w:rPr>
+          <w:b/>
+          <w:sz w:val="28"/>
+        </w:rPr>
         <w:t>Deciding the Push Target</w:t>
       </w:r>
     </w:p>
     <w:p>
       <w:pPr>
-        <w:pStyle w:val="ListBullet"/>
+        <w:spacing w:after="40"/>
       </w:pPr>
       <w:r>
+        <w:rPr>
+          <w:b/>
+          <w:sz w:val="22"/>
+        </w:rPr>
         <w:t>Prompt used:</w:t>
       </w:r>
     </w:p>
     <w:p>
+      <w:pPr>
+        <w:spacing w:after="120"/>
+      </w:pPr>
       <w:r>
         <w:rPr>
-          <w:i/>
+          <w:b w:val="0"/>
+          <w:sz w:val="22"/>
         </w:rPr>
-        <w:t>(Answer to Big Pickle's question on where to push) "Push to github.com/benabeseeajen (Recommended)"</w:t>
+        <w:t>(Answer to Big Pickle's question on where to push) "Push to github.com/benabeseeajen (Recommended)</w:t>
       </w:r>
     </w:p>
     <w:p>
       <w:pPr>
-        <w:pStyle w:val="ListBullet"/>
+        <w:spacing w:after="40"/>
       </w:pPr>
       <w:r>
+        <w:rPr>
+          <w:b/>
+          <w:sz w:val="22"/>
+        </w:rPr>
         <w:t>Result/Output:</w:t>
       </w:r>
     </w:p>
     <w:p>
+      <w:pPr>
+        <w:spacing w:after="120"/>
+      </w:pPr>
       <w:r>
+        <w:rPr>
+          <w:b w:val="0"/>
+          <w:sz w:val="22"/>
+        </w:rPr>
         <w:t>It reported that it could not create/push a repo under benabeseeajen with the current credentials and asked how to proceed.</w:t>
       </w:r>
     </w:p>
     <w:p>
       <w:pPr>
-        <w:pStyle w:val="Heading1"/>
+        <w:spacing w:after="200"/>
       </w:pPr>
       <w:r>
+        <w:rPr>
+          <w:b/>
+          <w:sz w:val="28"/>
+        </w:rPr>
         <w:t>Reauthenticating to the Portfolio Account</w:t>
       </w:r>
     </w:p>
     <w:p>
       <w:pPr>
-        <w:pStyle w:val="ListBullet"/>
+        <w:spacing w:after="40"/>
       </w:pPr>
       <w:r>
+        <w:rPr>
+          <w:b/>
+          <w:sz w:val="22"/>
+        </w:rPr>
         <w:t>Prompt used:</w:t>
       </w:r>
     </w:p>
     <w:p>
+      <w:pPr>
+        <w:spacing w:after="120"/>
+      </w:pPr>
       <w:r>
         <w:rPr>
-          <w:i/>
+          <w:b w:val="0"/>
+          <w:sz w:val="22"/>
         </w:rPr>
-        <w:t>"reauthenticate to benabeseeajen-hue"</w:t>
+        <w:t>reauthenticate to benabeseeajen-hue</w:t>
       </w:r>
     </w:p>
     <w:p>
       <w:pPr>
-        <w:pStyle w:val="ListBullet"/>
+        <w:spacing w:after="40"/>
       </w:pPr>
       <w:r>
+        <w:rPr>
+          <w:b/>
+          <w:sz w:val="22"/>
+        </w:rPr>
         <w:t>Result/Output:</w:t>
       </w:r>
     </w:p>
     <w:p>
+      <w:pPr>
+        <w:spacing w:after="120"/>
+      </w:pPr>
       <w:r>
+        <w:rPr>
+          <w:b w:val="0"/>
+          <w:sz w:val="22"/>
+        </w:rPr>
         <w:t>Big Pickle ran "gh auth login --hostname github.com --git-protocol https --web". The user completed the one-time device code at github.com/login/device. Big Pickle verified via "gh api user" that the active account is benabeseeajen-hue — Eajen Rainier S. Benabese from Bangued, Abra. It created the public repository github.com/benabeseeajen-hue/portfolio, ran "gh auth setup-git", and pushed the main branch successfully. All GitHub profile links were corrected to the real account (the resume's "github.com/benabeseeajen" account does not exist).</w:t>
       </w:r>
     </w:p>
     <w:p>
       <w:pPr>
-        <w:pStyle w:val="Heading1"/>
+        <w:spacing w:after="200"/>
       </w:pPr>
       <w:r>
+        <w:rPr>
+          <w:b/>
+          <w:sz w:val="28"/>
+        </w:rPr>
         <w:t>Adding the Prompt Log</w:t>
       </w:r>
     </w:p>
     <w:p>
       <w:pPr>
-        <w:pStyle w:val="ListBullet"/>
+        <w:spacing w:after="40"/>
       </w:pPr>
       <w:r>
+        <w:rPr>
+          <w:b/>
+          <w:sz w:val="22"/>
+        </w:rPr>
         <w:t>Prompt used:</w:t>
       </w:r>
     </w:p>
     <w:p>
+      <w:pPr>
+        <w:spacing w:after="120"/>
+      </w:pPr>
       <w:r>
         <w:rPr>
-          <w:i/>
+          <w:b w:val="0"/>
+          <w:sz w:val="22"/>
         </w:rPr>
-        <w:t>"update prompt logs with the actual prompts used"</w:t>
+        <w:t>update prompt logs with the actual prompts used</w:t>
       </w:r>
     </w:p>
     <w:p>
       <w:pPr>
-        <w:pStyle w:val="ListBullet"/>
+        <w:spacing w:after="40"/>
       </w:pPr>
       <w:r>
+        <w:rPr>
+          <w:b/>
+          <w:sz w:val="22"/>
+        </w:rPr>
         <w:t>Result/Output:</w:t>
       </w:r>
     </w:p>
     <w:p>
+      <w:pPr>
+        <w:spacing w:after="120"/>
+      </w:pPr>
       <w:r>
+        <w:rPr>
+          <w:b w:val="0"/>
+          <w:sz w:val="22"/>
+        </w:rPr>
         <w:t>Big Pickle rewrote PROMPT_LOG.md and regenerated PROMPT_LOG.docx to reflect the actual prompts used during the session.</w:t>
       </w:r>
     </w:p>
     <w:p>
       <w:pPr>
-        <w:pStyle w:val="Heading1"/>
+        <w:spacing w:after="200"/>
       </w:pPr>
       <w:r>
+        <w:rPr>
+          <w:b/>
+          <w:sz w:val="28"/>
+        </w:rPr>
         <w:t>Refining the Prompt Log</w:t>
       </w:r>
     </w:p>
     <w:p>
       <w:pPr>
-        <w:pStyle w:val="ListBullet"/>
+        <w:spacing w:after="40"/>
       </w:pPr>
       <w:r>
+        <w:rPr>
+          <w:b/>
+          <w:sz w:val="22"/>
+        </w:rPr>
         <w:t>Prompt used:</w:t>
       </w:r>
     </w:p>
     <w:p>
+      <w:pPr>
+        <w:spacing w:after="120"/>
+      </w:pPr>
       <w:r>
         <w:rPr>
-          <w:i/>
+          <w:b w:val="0"/>
+          <w:sz w:val="22"/>
         </w:rPr>
-        <w:t>"rewrite with the actual prompts I put in"</w:t>
+        <w:t>rewrite with the actual prompts I put in</w:t>
       </w:r>
     </w:p>
     <w:p>
       <w:pPr>
-        <w:pStyle w:val="ListBullet"/>
+        <w:spacing w:after="40"/>
       </w:pPr>
       <w:r>
+        <w:rPr>
+          <w:b/>
+          <w:sz w:val="22"/>
+        </w:rPr>
         <w:t>Result/Output:</w:t>
       </w:r>
     </w:p>
     <w:p>
+      <w:pPr>
+        <w:spacing w:after="120"/>
+      </w:pPr>
       <w:r>
+        <w:rPr>
+          <w:b w:val="0"/>
+          <w:sz w:val="22"/>
+        </w:rPr>
         <w:t>Big Pickle confirmed that the terms recorded are the user's own inputs, not reconstructed theme prompts. It rewrote the logs to list each prompt exactly as the user typed it ("implement greatplan.md" and the user's responses), in the order used, start to finish.</w:t>
       </w:r>
     </w:p>
     <w:p>
       <w:pPr>
-        <w:pStyle w:val="Heading1"/>
+        <w:spacing w:after="200"/>
       </w:pPr>
       <w:r>
+        <w:rPr>
+          <w:b/>
+          <w:sz w:val="28"/>
+        </w:rPr>
         <w:t>Committing Imported Source Files</w:t>
       </w:r>
     </w:p>
     <w:p>
       <w:pPr>
-        <w:pStyle w:val="ListBullet"/>
+        <w:spacing w:after="40"/>
       </w:pPr>
       <w:r>
+        <w:rPr>
+          <w:b/>
+          <w:sz w:val="22"/>
+        </w:rPr>
         <w:t>Prompt used:</w:t>
       </w:r>
     </w:p>
     <w:p>
+      <w:pPr>
+        <w:spacing w:after="120"/>
+      </w:pPr>
       <w:r>
         <w:rPr>
-          <w:i/>
+          <w:b w:val="0"/>
+          <w:sz w:val="22"/>
         </w:rPr>
-        <w:t>"update promptlogs with this newest prompt, commit newly imported files to repo. namely 'greatplan.md' &amp; 'resume.md' with a comprehensive non vague commit message of course."</w:t>
+        <w:t>update promptlogs with this newest prompt, commit newly imported files to repo. namely 'greatplan.md' &amp; 'resume.md' with a comprehensive non vague commit message of course.</w:t>
       </w:r>
     </w:p>
     <w:p>
       <w:pPr>
-        <w:pStyle w:val="ListBullet"/>
+        <w:spacing w:after="40"/>
       </w:pPr>
       <w:r>
+        <w:rPr>
+          <w:b/>
+          <w:sz w:val="22"/>
+        </w:rPr>
         <w:t>Result/Output:</w:t>
       </w:r>
     </w:p>
     <w:p>
+      <w:pPr>
+        <w:spacing w:after="120"/>
+      </w:pPr>
       <w:r>
+        <w:rPr>
+          <w:b w:val="0"/>
+          <w:sz w:val="22"/>
+        </w:rPr>
         <w:t>Big Pickle appended this entry to PROMPT_LOG.md and regenerated PROMPT_LOG.docx, then staged the imported greatplan.md and resume.md source files and committed them with a descriptive, non-vague commit message detailing the project plan and resume data added to the repository.</w:t>
       </w:r>
     </w:p>
     <w:p>
       <w:pPr>
-        <w:pStyle w:val="Heading1"/>
+        <w:spacing w:after="200"/>
       </w:pPr>
       <w:r>
+        <w:rPr>
+          <w:b/>
+          <w:sz w:val="28"/>
+        </w:rPr>
         <w:t>Renaming the Prompt Log Document and Adding a Commit History</w:t>
       </w:r>
     </w:p>
     <w:p>
       <w:pPr>
-        <w:pStyle w:val="ListBullet"/>
+        <w:spacing w:after="40"/>
       </w:pPr>
       <w:r>
+        <w:rPr>
+          <w:b/>
+          <w:sz w:val="22"/>
+        </w:rPr>
         <w:t>Prompt used:</w:t>
       </w:r>
     </w:p>
     <w:p>
+      <w:pPr>
+        <w:spacing w:after="120"/>
+      </w:pPr>
       <w:r>
         <w:rPr>
-          <w:i/>
+          <w:b w:val="0"/>
+          <w:sz w:val="22"/>
         </w:rPr>
-        <w:t>"rename prompt_log.docx to AI_PROMPT_DOCUMENTATION.docx. make a different docx containing the latest commit histories in it. update the two logs, the md and the renamed one, and push accordingly."</w:t>
+        <w:t>rename prompt_log.docx to AI_PROMPT_DOCUMENTATION.docx. make a different docx containing the latest commit histories in it. update the two logs, the md and the renamed one, and push accordingly.</w:t>
       </w:r>
     </w:p>
     <w:p>
       <w:pPr>
-        <w:pStyle w:val="ListBullet"/>
+        <w:spacing w:after="40"/>
       </w:pPr>
       <w:r>
+        <w:rPr>
+          <w:b/>
+          <w:sz w:val="22"/>
+        </w:rPr>
         <w:t>Result/Output:</w:t>
       </w:r>
     </w:p>
     <w:p>
+      <w:pPr>
+        <w:spacing w:after="120"/>
+      </w:pPr>
       <w:r>
+        <w:rPr>
+          <w:b w:val="0"/>
+          <w:sz w:val="22"/>
+        </w:rPr>
         <w:t>Big Pickle renamed PROMPT_LOG.docx to AI_PROMPT_DOCUMENTATION.docx, generated a separate COMMIT_HISTORY.docx listing the latest git commits, and updated both prompt logs (PROMPT_LOG.md and the renamed AI_PROMPT_DOCUMENTATION.docx) with this entry before pushing the changes.</w:t>
       </w:r>
     </w:p>
     <w:p>
       <w:pPr>
-        <w:pStyle w:val="Heading1"/>
+        <w:spacing w:after="200"/>
       </w:pPr>
       <w:r>
+        <w:rPr>
+          <w:b/>
+          <w:sz w:val="28"/>
+        </w:rPr>
         <w:t>The Final Reckoning — Design Polish and Production Release</w:t>
       </w:r>
     </w:p>
     <w:p>
       <w:pPr>
-        <w:pStyle w:val="ListBullet"/>
+        <w:spacing w:after="40"/>
       </w:pPr>
       <w:r>
+        <w:rPr>
+          <w:b/>
+          <w:sz w:val="22"/>
+        </w:rPr>
         <w:t>Prompt used:</w:t>
       </w:r>
     </w:p>
     <w:p>
+      <w:pPr>
+        <w:spacing w:after="120"/>
+      </w:pPr>
       <w:r>
         <w:rPr>
-          <w:i/>
+          <w:b w:val="0"/>
+          <w:sz w:val="22"/>
         </w:rPr>
-        <w:t>"exec hulingpaksa.md, update both promptdocu and promptlog"</w:t>
+        <w:t>exec hulingpaksa.md, update both promptdocu and promptlog</w:t>
       </w:r>
     </w:p>
     <w:p>
       <w:pPr>
-        <w:pStyle w:val="ListBullet"/>
+        <w:spacing w:after="40"/>
       </w:pPr>
       <w:r>
+        <w:rPr>
+          <w:b/>
+          <w:sz w:val="22"/>
+        </w:rPr>
         <w:t>Result/Output:</w:t>
       </w:r>
     </w:p>
     <w:p>
+      <w:pPr>
+        <w:spacing w:after="120"/>
+      </w:pPr>
       <w:r>
+        <w:rPr>
+          <w:b w:val="0"/>
+          <w:sz w:val="22"/>
+        </w:rPr>
         <w:t>Big Pickle followed the hulingpaksa.md (final reckoning) process. It installed the motion.dev 'motion' package, rewrote resources/js/app.js to drive scroll-reveal entrance animations (respecting prefers-reduced-motion), and added data-reveal / data-reveal-item attributes across the hero, education, experience, skills, projects, and connect sections, plus a gradient text treatment on the hero name. It thoroughly checked the app (HTTP 200, clean Vite production build) and pushed a comprehensive commit. At the ask-to-proceed checkpoint it asked how to continue.</w:t>
       </w:r>
     </w:p>
     <w:p>
       <w:pPr>
-        <w:pStyle w:val="Heading1"/>
+        <w:spacing w:after="200"/>
       </w:pPr>
       <w:r>
+        <w:rPr>
+          <w:b/>
+          <w:sz w:val="28"/>
+        </w:rPr>
         <w:t>Renaming the Header Brand Title</w:t>
       </w:r>
     </w:p>
     <w:p>
       <w:pPr>
-        <w:pStyle w:val="ListBullet"/>
+        <w:spacing w:after="40"/>
       </w:pPr>
       <w:r>
+        <w:rPr>
+          <w:b/>
+          <w:sz w:val="22"/>
+        </w:rPr>
         <w:t>Prompt used:</w:t>
       </w:r>
     </w:p>
     <w:p>
+      <w:pPr>
+        <w:spacing w:after="120"/>
+      </w:pPr>
       <w:r>
         <w:rPr>
-          <w:i/>
+          <w:b w:val="0"/>
+          <w:sz w:val="22"/>
         </w:rPr>
-        <w:t>(Answer to Big Pickle's ask-to-proceed question) "update header tile 'EB' with 'eajen.free.nf' before full finalization."</w:t>
+        <w:t>(Answer to Big Pickle's ask-to-proceed question) "update header tile 'EB' with 'eajen.free.nf' before full finalization.</w:t>
       </w:r>
     </w:p>
     <w:p>
       <w:pPr>
-        <w:pStyle w:val="ListBullet"/>
+        <w:spacing w:after="40"/>
       </w:pPr>
       <w:r>
+        <w:rPr>
+          <w:b/>
+          <w:sz w:val="22"/>
+        </w:rPr>
         <w:t>Result/Output:</w:t>
       </w:r>
     </w:p>
     <w:p>
+      <w:pPr>
+        <w:spacing w:after="120"/>
+      </w:pPr>
       <w:r>
-        <w:t>Big Pickle changed the navigation header brand from "EB" to "eajen.free.nf", rebuilt the assets (clean production build), and committed the change. Continuing the finalization, it committed the InfinityFree production release files (htdocs.htaccess and .env.infinityfree), documented the deployment in README.md, then updated both prompt logs (PROMPT_LOG.md and AI_PROMPT_DOCUMENTATION.docx) before the final push.</w:t>
+        <w:rPr>
+          <w:b w:val="0"/>
+          <w:sz w:val="22"/>
+        </w:rPr>
+        <w:t>Big Pickle changed the navigation header brand from "EB" to "eajen.free.nf", rebuilt the assets (clean production build), and committed the change. Continuing the finalization, it committed the InfinityFree production release files (htdocs.htaccess and .env.infinityfree), documented the deployment in README.md, then updated both prompt logs (this PROMPT_LOG.md and AI_PROMPT_DOCUMENTATION.docx) before the final push.</w:t>
+      </w:r>
+    </w:p>
+    <w:p>
+      <w:pPr>
+        <w:spacing w:after="200"/>
+      </w:pPr>
+      <w:r>
+        <w:rPr>
+          <w:b/>
+          <w:sz w:val="28"/>
+        </w:rPr>
+        <w:t>Project Master Patch (Awwwards Tier)</w:t>
+      </w:r>
+    </w:p>
+    <w:p>
+      <w:pPr>
+        <w:spacing w:after="40"/>
+      </w:pPr>
+      <w:r>
+        <w:rPr>
+          <w:b/>
+          <w:sz w:val="22"/>
+        </w:rPr>
+        <w:t>Prompt used:</w:t>
+      </w:r>
+    </w:p>
+    <w:p>
+      <w:pPr>
+        <w:spacing w:after="120"/>
+      </w:pPr>
+      <w:r>
+        <w:rPr>
+          <w:b w:val="0"/>
+          <w:sz w:val="22"/>
+        </w:rPr>
+        <w:t>run patchup.md</w:t>
+      </w:r>
+    </w:p>
+    <w:p>
+      <w:pPr>
+        <w:spacing w:after="40"/>
+      </w:pPr>
+      <w:r>
+        <w:rPr>
+          <w:b/>
+          <w:sz w:val="22"/>
+        </w:rPr>
+        <w:t>Result/Output:</w:t>
+      </w:r>
+    </w:p>
+    <w:p>
+      <w:pPr>
+        <w:spacing w:after="120"/>
+      </w:pPr>
+      <w:r>
+        <w:rPr>
+          <w:b w:val="0"/>
+          <w:sz w:val="22"/>
+        </w:rPr>
+        <w:t>Big Pickle read patchup.md and applied the Portfolio Master Patch Specification. It established the OLED dark visual architecture (`#050505` canvas) with the double-bezel concentric card archetype (bg-white/[0.03] border shells wrapping bg-zinc-950/80 cores), indigo-to-purple ambient gradients, and the micro-eyebrow / display-header / body-prose typography hierarchy. It wired motion.dev spring kinetics (easing cubic-bezier(0.32, 0.72, 0, 1)) with staggered scroll reveals, blur-to-sharp transitions, magnetic-scale interactive islands, and the detached fluid glass navigation island with a button-in-button Get in Touch CTA. It added the concentric double-bezel header profile ring (eb.jpg with monogram fallback), the verified GitHub/Instagram/Facebook socials, the nine-language skills matrix with primary/secondary badge treatments, the featured Bayugo Dental Record Management and High-End Developer Portfolio project cards, and the interactive Three.js particle constellation background (device pixel ratio clamped to 1.5) with a static radial mesh fallback. It added `three` to the dependencies and finished with a clean production build.</w:t>
+      </w:r>
+    </w:p>
+    <w:p>
+      <w:pPr>
+        <w:spacing w:after="200"/>
+      </w:pPr>
+      <w:r>
+        <w:rPr>
+          <w:b/>
+          <w:sz w:val="28"/>
+        </w:rPr>
+        <w:t>Recording Final Freeze and Final Push</w:t>
+      </w:r>
+    </w:p>
+    <w:p>
+      <w:pPr>
+        <w:spacing w:after="40"/>
+      </w:pPr>
+      <w:r>
+        <w:rPr>
+          <w:b/>
+          <w:sz w:val="22"/>
+        </w:rPr>
+        <w:t>Prompt used:</w:t>
+      </w:r>
+    </w:p>
+    <w:p>
+      <w:pPr>
+        <w:spacing w:after="120"/>
+      </w:pPr>
+      <w:r>
+        <w:rPr>
+          <w:b w:val="0"/>
+          <w:sz w:val="22"/>
+        </w:rPr>
+        <w:t>write this in the prompt log and docu before pushing then push as finalfinal push with non vague short sum of what you did with patchup.md.</w:t>
+      </w:r>
+    </w:p>
+    <w:p>
+      <w:pPr>
+        <w:spacing w:after="40"/>
+      </w:pPr>
+      <w:r>
+        <w:rPr>
+          <w:b/>
+          <w:sz w:val="22"/>
+        </w:rPr>
+        <w:t>Result/Output:</w:t>
+      </w:r>
+    </w:p>
+    <w:p>
+      <w:pPr>
+        <w:spacing w:after="120"/>
+      </w:pPr>
+      <w:r>
+        <w:rPr>
+          <w:b w:val="0"/>
+          <w:sz w:val="22"/>
+        </w:rPr>
+        <w:t>Big Pickle appended this session record to PROMPT_LOG.md and regenerated AI_PROMPT_DOCUMENTATION.docx from it, then staged both prompt logs and created the final commit with a non-vague summary of the patchup.md design work only just before pushing everything to the benabeseeajen-hue/portfolio repository.</w:t>
       </w:r>
     </w:p>
     <w:sectPr>
@@ -431,70 +708,7 @@
 </w:document>
 </file>
 
-<file path=word\fontTable.xml><?xml version="1.0" encoding="utf-8"?>
-<w:fonts xmlns:mc="http://schemas.openxmlformats.org/markup-compatibility/2006" xmlns:r="http://schemas.openxmlformats.org/officeDocument/2006/relationships" xmlns:w="http://schemas.openxmlformats.org/wordprocessingml/2006/main" xmlns:w14="http://schemas.microsoft.com/office/word/2010/wordml" mc:Ignorable="w14">
-  <w:font w:name="Symbol">
-    <w:panose1 w:val="00000000000000000000"/>
-    <w:charset w:val="02"/>
-    <w:family w:val="auto"/>
-    <w:pitch w:val="variable"/>
-    <w:sig w:usb0="00000000" w:usb1="10000000" w:usb2="00000000" w:usb3="00000000" w:csb0="80000000" w:csb1="00000000"/>
-  </w:font>
-  <w:font w:name="Times New Roman">
-    <w:panose1 w:val="02020603050405020304"/>
-    <w:charset w:val="00"/>
-    <w:family w:val="auto"/>
-    <w:pitch w:val="variable"/>
-    <w:sig w:usb0="E0002AFF" w:usb1="C0007841" w:usb2="00000009" w:usb3="00000000" w:csb0="000001FF" w:csb1="00000000"/>
-  </w:font>
-  <w:font w:name="Cambria">
-    <w:panose1 w:val="02040503050406030204"/>
-    <w:charset w:val="00"/>
-    <w:family w:val="auto"/>
-    <w:pitch w:val="variable"/>
-    <w:sig w:usb0="E00002FF" w:usb1="400004FF" w:usb2="00000000" w:usb3="00000000" w:csb0="0000019F" w:csb1="00000000"/>
-  </w:font>
-  <w:font w:name="ＭＳ 明朝">
-    <w:panose1 w:val="00000000000000000000"/>
-    <w:charset w:val="80"/>
-    <w:family w:val="roman"/>
-    <w:notTrueType/>
-    <w:pitch w:val="fixed"/>
-    <w:sig w:usb0="00000001" w:usb1="08070000" w:usb2="00000010" w:usb3="00000000" w:csb0="00020000" w:csb1="00000000"/>
-  </w:font>
-  <w:font w:name="Calibri">
-    <w:panose1 w:val="020F0502020204030204"/>
-    <w:charset w:val="00"/>
-    <w:family w:val="auto"/>
-    <w:pitch w:val="variable"/>
-    <w:sig w:usb0="E10002FF" w:usb1="4000ACFF" w:usb2="00000009" w:usb3="00000000" w:csb0="0000019F" w:csb1="00000000"/>
-  </w:font>
-  <w:font w:name="ＭＳ ゴシック">
-    <w:panose1 w:val="00000000000000000000"/>
-    <w:charset w:val="80"/>
-    <w:family w:val="modern"/>
-    <w:notTrueType/>
-    <w:pitch w:val="fixed"/>
-    <w:sig w:usb0="00000001" w:usb1="08070000" w:usb2="00000010" w:usb3="00000000" w:csb0="00020000" w:csb1="00000000"/>
-  </w:font>
-  <w:font w:name="Courier">
-    <w:panose1 w:val="02000500000000000000"/>
-    <w:charset w:val="00"/>
-    <w:family w:val="auto"/>
-    <w:pitch w:val="variable"/>
-    <w:sig w:usb0="00000003" w:usb1="00000000" w:usb2="00000000" w:usb3="00000000" w:csb0="00000001" w:csb1="00000000"/>
-  </w:font>
-  <w:font w:name="Arial">
-    <w:panose1 w:val="020B0604020202020204"/>
-    <w:charset w:val="00"/>
-    <w:family w:val="auto"/>
-    <w:pitch w:val="variable"/>
-    <w:sig w:usb0="E0002AFF" w:usb1="C0007843" w:usb2="00000009" w:usb3="00000000" w:csb0="000001FF" w:csb1="00000000"/>
-  </w:font>
-</w:fonts>
-</file>
-
-<file path=word\numbering.xml><?xml version="1.0" encoding="utf-8"?>
+<file path=word/numbering.xml><?xml version="1.0" encoding="utf-8"?>
 <w:numbering xmlns:wpc="http://schemas.microsoft.com/office/word/2010/wordprocessingCanvas" xmlns:mo="http://schemas.microsoft.com/office/mac/office/2008/main" xmlns:mc="http://schemas.openxmlformats.org/markup-compatibility/2006" xmlns:mv="urn:schemas-microsoft-com:mac:vml" xmlns:o="urn:schemas-microsoft-com:office:office" xmlns:r="http://schemas.openxmlformats.org/officeDocument/2006/relationships" xmlns:m="http://schemas.openxmlformats.org/officeDocument/2006/math" xmlns:v="urn:schemas-microsoft-com:vml" xmlns:wp14="http://schemas.microsoft.com/office/word/2010/wordprocessingDrawing" xmlns:wp="http://schemas.openxmlformats.org/drawingml/2006/wordprocessingDrawing" xmlns:w10="urn:schemas-microsoft-com:office:word" xmlns:w="http://schemas.openxmlformats.org/wordprocessingml/2006/main" xmlns:w14="http://schemas.microsoft.com/office/word/2010/wordml" xmlns:wpg="http://schemas.microsoft.com/office/word/2010/wordprocessingGroup" xmlns:wpi="http://schemas.microsoft.com/office/word/2010/wordprocessingInk" xmlns:wne="http://schemas.microsoft.com/office/word/2006/wordml" xmlns:wps="http://schemas.microsoft.com/office/word/2010/wordprocessingShape" mc:Ignorable="w14 wp14">
   <w:abstractNum w:abstractNumId="0">
     <w:nsid w:val="FFFFFF7C"/>
@@ -697,62 +911,7 @@
 </w:numbering>
 </file>
 
-<file path=word\settings.xml><?xml version="1.0" encoding="utf-8"?>
-<w:settings xmlns:mc="http://schemas.openxmlformats.org/markup-compatibility/2006" xmlns:o="urn:schemas-microsoft-com:office:office" xmlns:r="http://schemas.openxmlformats.org/officeDocument/2006/relationships" xmlns:m="http://schemas.openxmlformats.org/officeDocument/2006/math" xmlns:v="urn:schemas-microsoft-com:vml" xmlns:w10="urn:schemas-microsoft-com:office:word" xmlns:w="http://schemas.openxmlformats.org/wordprocessingml/2006/main" xmlns:w14="http://schemas.microsoft.com/office/word/2010/wordml" xmlns:sl="http://schemas.openxmlformats.org/schemaLibrary/2006/main" mc:Ignorable="w14">
-  <w:zoom w:val="bestFit"/>
-  <w:proofState w:spelling="clean" w:grammar="clean"/>
-  <w:defaultTabStop w:val="720"/>
-  <w:characterSpacingControl w:val="doNotCompress"/>
-  <w:savePreviewPicture/>
-  <w:compat>
-    <w:useFELayout/>
-    <w:compatSetting w:name="compatibilityMode" w:uri="http://schemas.microsoft.com/office/word" w:val="14"/>
-    <w:compatSetting w:name="overrideTableStyleFontSizeAndJustification" w:uri="http://schemas.microsoft.com/office/word" w:val="1"/>
-    <w:compatSetting w:name="enableOpenTypeFeatures" w:uri="http://schemas.microsoft.com/office/word" w:val="1"/>
-    <w:compatSetting w:name="doNotFlipMirrorIndents" w:uri="http://schemas.microsoft.com/office/word" w:val="1"/>
-  </w:compat>
-  <w:rsids>
-    <w:rsidRoot w:val="00B47730"/>
-    <w:rsid w:val="00034616"/>
-    <w:rsid w:val="0006063C"/>
-    <w:rsid w:val="0015074B"/>
-    <w:rsid w:val="0029639D"/>
-    <w:rsid w:val="00326F90"/>
-    <w:rsid w:val="00AA1D8D"/>
-    <w:rsid w:val="00B47730"/>
-    <w:rsid w:val="00CB0664"/>
-    <w:rsid w:val="00FC693F"/>
-  </w:rsids>
-  <m:mathPr>
-    <m:mathFont m:val="Cambria Math"/>
-    <m:brkBin m:val="before"/>
-    <m:brkBinSub m:val="--"/>
-    <m:smallFrac m:val="0"/>
-    <m:dispDef/>
-    <m:lMargin m:val="0"/>
-    <m:rMargin m:val="0"/>
-    <m:defJc m:val="centerGroup"/>
-    <m:wrapIndent m:val="1440"/>
-    <m:intLim m:val="subSup"/>
-    <m:naryLim m:val="undOvr"/>
-  </m:mathPr>
-  <w:themeFontLang w:val="en-US" w:eastAsia="ja-JP"/>
-  <w:clrSchemeMapping w:bg1="light1" w:t1="dark1" w:bg2="light2" w:t2="dark2" w:accent1="accent1" w:accent2="accent2" w:accent3="accent3" w:accent4="accent4" w:accent5="accent5" w:accent6="accent6" w:hyperlink="hyperlink" w:followedHyperlink="followedHyperlink"/>
-  <w:doNotAutoCompressPictures/>
-  <w:shapeDefaults>
-    <o:shapedefaults v:ext="edit" spidmax="1027"/>
-    <o:shapelayout v:ext="edit">
-      <o:idmap v:ext="edit" data="1"/>
-    </o:shapelayout>
-  </w:shapeDefaults>
-  <w:decimalSymbol w:val="."/>
-  <w:listSeparator w:val=","/>
-  <w14:docId w14:val="24062061"/>
-  <w14:defaultImageDpi w14:val="300"/>
-</w:settings>
-</file>
-
-<file path=word\styles.xml><?xml version="1.0" encoding="utf-8"?>
+<file path=word/styles.xml><?xml version="1.0" encoding="utf-8"?>
 <w:styles xmlns:mc="http://schemas.openxmlformats.org/markup-compatibility/2006" xmlns:r="http://schemas.openxmlformats.org/officeDocument/2006/relationships" xmlns:w="http://schemas.openxmlformats.org/wordprocessingml/2006/main" xmlns:w14="http://schemas.microsoft.com/office/word/2010/wordml" mc:Ignorable="w14">
   <w:docDefaults>
     <w:rPrDefault>
@@ -12598,7 +12757,7 @@
 </w:styles>
 </file>
 
-<file path=word\stylesWithEffects.xml><?xml version="1.0" encoding="utf-8"?>
+<file path=word/stylesWithEffects.xml><?xml version="1.0" encoding="utf-8"?>
 <w:styles xmlns:wpc="http://schemas.microsoft.com/office/word/2010/wordprocessingCanvas" xmlns:mo="http://schemas.microsoft.com/office/mac/office/2008/main" xmlns:mc="http://schemas.openxmlformats.org/markup-compatibility/2006" xmlns:mv="urn:schemas-microsoft-com:mac:vml" xmlns:o="urn:schemas-microsoft-com:office:office" xmlns:r="http://schemas.openxmlformats.org/officeDocument/2006/relationships" xmlns:m="http://schemas.openxmlformats.org/officeDocument/2006/math" xmlns:v="urn:schemas-microsoft-com:vml" xmlns:wp14="http://schemas.microsoft.com/office/word/2010/wordprocessingDrawing" xmlns:wp="http://schemas.openxmlformats.org/drawingml/2006/wordprocessingDrawing" xmlns:w10="urn:schemas-microsoft-com:office:word" xmlns:w="http://schemas.openxmlformats.org/wordprocessingml/2006/main" xmlns:w14="http://schemas.microsoft.com/office/word/2010/wordml" xmlns:wpg="http://schemas.microsoft.com/office/word/2010/wordprocessingGroup" xmlns:wpi="http://schemas.microsoft.com/office/word/2010/wordprocessingInk" xmlns:wne="http://schemas.microsoft.com/office/word/2006/wordml" xmlns:wps="http://schemas.microsoft.com/office/word/2010/wordprocessingShape" mc:Ignorable="w14 wp14">
   <w:docDefaults>
     <w:rPrDefault>
@@ -24400,7 +24559,7 @@
 </w:styles>
 </file>
 
-<file path=word\theme\theme1.xml><?xml version="1.0" encoding="utf-8"?>
+<file path=word/theme/theme1.xml><?xml version="1.0" encoding="utf-8"?>
 <a:theme xmlns:a="http://schemas.openxmlformats.org/drawingml/2006/main" name="Office Theme">
   <a:themeElements>
     <a:clrScheme name="Office">
@@ -24720,9 +24879,14 @@
 </a:theme>
 </file>
 
-<file path=word\webSettings.xml><?xml version="1.0" encoding="utf-8"?>
-<w:webSettings xmlns:mc="http://schemas.openxmlformats.org/markup-compatibility/2006" xmlns:r="http://schemas.openxmlformats.org/officeDocument/2006/relationships" xmlns:w="http://schemas.openxmlformats.org/wordprocessingml/2006/main" xmlns:w14="http://schemas.microsoft.com/office/word/2010/wordml" mc:Ignorable="w14">
-  <w:allowPNG/>
-  <w:doNotSaveAsSingleFile/>
-</w:webSettings>
+<file path=customXml/item1.xml><?xml version="1.0" encoding="utf-8"?>
+<b:Sources xmlns:b="http://schemas.openxmlformats.org/officeDocument/2006/bibliography" xmlns="http://schemas.openxmlformats.org/officeDocument/2006/bibliography" SelectedStyle="/APA.XSL" StyleName="APA"/>
+</file>
+
+<file path=customXml/itemProps1.xml><?xml version="1.0" encoding="utf-8"?>
+<ds:datastoreItem xmlns:ds="http://schemas.openxmlformats.org/officeDocument/2006/customXml" ds:itemID="{EF278816-EC6F-A645-907D-7F25AECB1D4A}">
+  <ds:schemaRefs>
+    <ds:schemaRef ds:uri="http://schemas.openxmlformats.org/officeDocument/2006/bibliography"/>
+  </ds:schemaRefs>
+</ds:datastoreItem>
 </file>
</xml_diff>